<commit_message>
Fix beautiful-creations proforma amount-in-words placeholder
The amount in words was split across two runs, so the contiguous-string
replace silently failed and left the hardcoded sample words ('SIXTY-ONE
THOUSAND ...') — they would never update. Replace the split runs with
{{grandTotalWords}} so the figure spelled out tracks the grand total.

The other three proformas were already correct (single-run words).

Co-Authored-By: Claude Opus 4.8 <noreply@anthropic.com>
</commit_message>
<xml_diff>
--- a/public/templates/beautiful-creations/proforma/PROFORMA.docx
+++ b/public/templates/beautiful-creations/proforma/PROFORMA.docx
@@ -1760,7 +1760,7 @@
                 <w:sz w:val="28"/>
                 <w:szCs w:val="28"/>
               </w:rPr>
-              <w:t xml:space="preserve">SIXTY-ONE THOUSAND, SEVEN HUNDRED AND SIXTEEN </w:t>
+              <w:t xml:space="preserve">{{grandTotalWords}}.</w:t>
             </w:r>
             <w:r>
               <w:rPr>
@@ -1769,7 +1769,7 @@
                 <w:sz w:val="28"/>
                 <w:szCs w:val="28"/>
               </w:rPr>
-              <w:t>GHANA CEDIS ONLY.</w:t>
+              <w:t/>
             </w:r>
           </w:p>
         </w:tc>

</xml_diff>